<commit_message>
Add comment about 14.07
</commit_message>
<xml_diff>
--- a/Report.docx
+++ b/Report.docx
@@ -6875,7 +6875,13 @@
         <w:t>С</w:t>
       </w:r>
       <w:r>
-        <w:t>лучайная генерация графа по заданным параметрам;</w:t>
+        <w:t>лучайная генерация графа по заданным параметрам</w:t>
+      </w:r>
+      <w:r>
+        <w:t xml:space="preserve"> (см. в Приложении А)</w:t>
+      </w:r>
+      <w:r>
+        <w:t>;</w:t>
       </w:r>
     </w:p>
     <w:p>
@@ -6891,7 +6897,13 @@
         <w:t>Р</w:t>
       </w:r>
       <w:r>
-        <w:t>учной ввод графа посредством заполнения матрицы смежности.</w:t>
+        <w:t>учной ввод графа посредством заполнения матрицы смежности</w:t>
+      </w:r>
+      <w:r>
+        <w:t xml:space="preserve"> (см. в Приложении А)</w:t>
+      </w:r>
+      <w:r>
+        <w:t>.</w:t>
       </w:r>
     </w:p>
     <w:p>
@@ -7105,6 +7117,7 @@
         <w:pStyle w:val="a1"/>
       </w:pPr>
       <w:r>
+        <w:lastRenderedPageBreak/>
         <w:t xml:space="preserve">Изменение указанных параметров позволяет исследовать влияние различных настроек на скорость сходимости алгоритма </w:t>
       </w:r>
       <w:r>
@@ -7122,7 +7135,6 @@
           <w:noProof/>
           <w:lang w:eastAsia="ru-RU" w:bidi="ar-SA"/>
         </w:rPr>
-        <w:lastRenderedPageBreak/>
         <w:drawing>
           <wp:inline distT="0" distB="0" distL="0" distR="0" wp14:anchorId="4ECF88C8" wp14:editId="75B9E606">
             <wp:extent cx="3045125" cy="1666360"/>
@@ -7705,7 +7717,6 @@
         <w:ind w:firstLine="0"/>
         <w:jc w:val="center"/>
       </w:pPr>
-      <w:bookmarkStart w:id="31" w:name="_GoBack"/>
       <w:r>
         <w:rPr>
           <w:noProof/>
@@ -7753,7 +7764,6 @@
           </wp:inline>
         </w:drawing>
       </w:r>
-      <w:bookmarkEnd w:id="31"/>
     </w:p>
     <w:p>
       <w:pPr>
@@ -7769,12 +7779,12 @@
       <w:pPr>
         <w:pStyle w:val="4"/>
       </w:pPr>
-      <w:bookmarkStart w:id="32" w:name="_Toc234849656"/>
+      <w:bookmarkStart w:id="31" w:name="_Toc234849656"/>
       <w:r>
         <w:lastRenderedPageBreak/>
         <w:t>2.5.6 Блок «График эволюции»</w:t>
       </w:r>
-      <w:bookmarkEnd w:id="32"/>
+      <w:bookmarkEnd w:id="31"/>
     </w:p>
     <w:p>
       <w:pPr>
@@ -7904,7 +7914,7 @@
           <w:numId w:val="2"/>
         </w:numPr>
       </w:pPr>
-      <w:bookmarkStart w:id="33" w:name="_Toc234849657"/>
+      <w:bookmarkStart w:id="32" w:name="_Toc234849657"/>
       <w:r>
         <w:t>2.</w:t>
       </w:r>
@@ -7917,7 +7927,7 @@
       <w:r>
         <w:t>Проектирование интеграции основного алгоритма в графический интерфейс</w:t>
       </w:r>
-      <w:bookmarkEnd w:id="33"/>
+      <w:bookmarkEnd w:id="32"/>
     </w:p>
     <w:p>
       <w:pPr>
@@ -8113,23 +8123,23 @@
           <w:numId w:val="2"/>
         </w:numPr>
       </w:pPr>
-      <w:bookmarkStart w:id="34" w:name="_Toc234849658"/>
+      <w:bookmarkStart w:id="33" w:name="_Toc234849658"/>
       <w:r>
         <w:lastRenderedPageBreak/>
         <w:t>3 ИСПОЛЬЗУЕМЫЕ ТЕХНОЛОГИИ</w:t>
       </w:r>
-      <w:bookmarkEnd w:id="34"/>
+      <w:bookmarkEnd w:id="33"/>
     </w:p>
     <w:p>
       <w:pPr>
         <w:pStyle w:val="3"/>
         <w:ind w:left="0"/>
       </w:pPr>
-      <w:bookmarkStart w:id="35" w:name="_Toc234849659"/>
+      <w:bookmarkStart w:id="34" w:name="_Toc234849659"/>
       <w:r>
         <w:t>3.1 Генератор случайных чисел для генерации графа</w:t>
       </w:r>
-      <w:bookmarkEnd w:id="35"/>
+      <w:bookmarkEnd w:id="34"/>
     </w:p>
     <w:p>
       <w:pPr>
@@ -8187,14 +8197,14 @@
         <w:pStyle w:val="3"/>
         <w:ind w:left="0"/>
       </w:pPr>
-      <w:bookmarkStart w:id="36" w:name="_Toc234849660"/>
+      <w:bookmarkStart w:id="35" w:name="_Toc234849660"/>
       <w:r>
         <w:t xml:space="preserve">3.2 Распределения для операторов </w:t>
       </w:r>
       <w:r>
         <w:t>генетического алгоритма</w:t>
       </w:r>
-      <w:bookmarkEnd w:id="36"/>
+      <w:bookmarkEnd w:id="35"/>
     </w:p>
     <w:p>
       <w:pPr>
@@ -8292,11 +8302,11 @@
         <w:pStyle w:val="3"/>
         <w:ind w:left="0"/>
       </w:pPr>
-      <w:bookmarkStart w:id="37" w:name="_Toc234849661"/>
+      <w:bookmarkStart w:id="36" w:name="_Toc234849661"/>
       <w:r>
         <w:t>3.3 Библиотеки для графического интерфейса</w:t>
       </w:r>
-      <w:bookmarkEnd w:id="37"/>
+      <w:bookmarkEnd w:id="36"/>
     </w:p>
     <w:p>
       <w:pPr>
@@ -8342,11 +8352,11 @@
       <w:pPr>
         <w:pStyle w:val="4"/>
       </w:pPr>
-      <w:bookmarkStart w:id="38" w:name="_Toc234849662"/>
+      <w:bookmarkStart w:id="37" w:name="_Toc234849662"/>
       <w:r>
         <w:t>3.3.1 Библиотека Dear ImGui</w:t>
       </w:r>
-      <w:bookmarkEnd w:id="38"/>
+      <w:bookmarkEnd w:id="37"/>
     </w:p>
     <w:p>
       <w:pPr>
@@ -8392,14 +8402,14 @@
       <w:pPr>
         <w:pStyle w:val="4"/>
       </w:pPr>
-      <w:bookmarkStart w:id="39" w:name="_Toc234849663"/>
+      <w:bookmarkStart w:id="38" w:name="_Toc234849663"/>
       <w:r>
         <w:t xml:space="preserve">3.3.2 Библиотека </w:t>
       </w:r>
       <w:r>
         <w:t>GLFW</w:t>
       </w:r>
-      <w:bookmarkEnd w:id="39"/>
+      <w:bookmarkEnd w:id="38"/>
     </w:p>
     <w:p>
       <w:pPr>
@@ -8504,12 +8514,12 @@
       <w:pPr>
         <w:pStyle w:val="4"/>
       </w:pPr>
-      <w:bookmarkStart w:id="40" w:name="_Toc234849664"/>
+      <w:bookmarkStart w:id="39" w:name="_Toc234849664"/>
       <w:r>
         <w:lastRenderedPageBreak/>
         <w:t>3.3.3 Библиотека ImPlot</w:t>
       </w:r>
-      <w:bookmarkEnd w:id="40"/>
+      <w:bookmarkEnd w:id="39"/>
     </w:p>
     <w:p>
       <w:pPr>
@@ -8551,12 +8561,12 @@
           <w:numId w:val="2"/>
         </w:numPr>
       </w:pPr>
-      <w:bookmarkStart w:id="41" w:name="_Toc234849665"/>
+      <w:bookmarkStart w:id="40" w:name="_Toc234849665"/>
       <w:r>
         <w:lastRenderedPageBreak/>
         <w:t>4 ОТЗЫВ РУКОВОДИТЕЛЯ</w:t>
       </w:r>
-      <w:bookmarkEnd w:id="41"/>
+      <w:bookmarkEnd w:id="40"/>
     </w:p>
     <w:p>
       <w:pPr>
@@ -8576,12 +8586,12 @@
         <w:pStyle w:val="2"/>
         <w:ind w:left="0"/>
       </w:pPr>
-      <w:bookmarkStart w:id="42" w:name="_Toc234849666"/>
+      <w:bookmarkStart w:id="41" w:name="_Toc234849666"/>
       <w:r>
         <w:lastRenderedPageBreak/>
         <w:t>ЗАКЛЮЧЕНИЕ</w:t>
       </w:r>
-      <w:bookmarkEnd w:id="42"/>
+      <w:bookmarkEnd w:id="41"/>
     </w:p>
     <w:p>
       <w:pPr>
@@ -8705,8 +8715,8 @@
           <w:rFonts w:cs="Times New Roman"/>
         </w:rPr>
       </w:pPr>
-      <w:bookmarkStart w:id="43" w:name="_Toc73173388"/>
-      <w:bookmarkStart w:id="44" w:name="_Toc234849667"/>
+      <w:bookmarkStart w:id="42" w:name="_Toc73173388"/>
+      <w:bookmarkStart w:id="43" w:name="_Toc234849667"/>
       <w:r>
         <w:rPr>
           <w:rFonts w:cs="Times New Roman"/>
@@ -8714,8 +8724,8 @@
         <w:lastRenderedPageBreak/>
         <w:t>СПИСОК ИСПОЛЬЗОВАННЫХ ИСТОЧНИКОВ</w:t>
       </w:r>
+      <w:bookmarkEnd w:id="42"/>
       <w:bookmarkEnd w:id="43"/>
-      <w:bookmarkEnd w:id="44"/>
     </w:p>
     <w:p>
       <w:pPr>
@@ -9011,7 +9021,7 @@
           <w:rFonts w:cs="Times New Roman"/>
         </w:rPr>
       </w:pPr>
-      <w:bookmarkStart w:id="45" w:name="_Toc234849668"/>
+      <w:bookmarkStart w:id="44" w:name="_Toc234849668"/>
       <w:r>
         <w:rPr>
           <w:rFonts w:cs="Times New Roman"/>
@@ -9020,7 +9030,7 @@
         <w:lastRenderedPageBreak/>
         <w:t>ПРИЛОЖЕНИЕ А</w:t>
       </w:r>
-      <w:bookmarkEnd w:id="45"/>
+      <w:bookmarkEnd w:id="44"/>
     </w:p>
     <w:p>
       <w:pPr>
@@ -9095,10 +9105,156 @@
         <w:t xml:space="preserve"> программы</w:t>
       </w:r>
     </w:p>
+    <w:p>
+      <w:pPr>
+        <w:pStyle w:val="a"/>
+        <w:numPr>
+          <w:ilvl w:val="0"/>
+          <w:numId w:val="0"/>
+        </w:numPr>
+        <w:jc w:val="center"/>
+      </w:pPr>
+      <w:r>
+        <w:rPr>
+          <w:noProof/>
+          <w:lang w:eastAsia="ru-RU" w:bidi="ar-SA"/>
+        </w:rPr>
+        <w:drawing>
+          <wp:inline distT="0" distB="0" distL="0" distR="0" wp14:anchorId="2004B2E8" wp14:editId="478E7D26">
+            <wp:extent cx="5734850" cy="4029637"/>
+            <wp:effectExtent l="0" t="0" r="0" b="9525"/>
+            <wp:docPr id="1" name="Рисунок 1"/>
+            <wp:cNvGraphicFramePr>
+              <a:graphicFrameLocks xmlns:a="http://schemas.openxmlformats.org/drawingml/2006/main" noChangeAspect="1"/>
+            </wp:cNvGraphicFramePr>
+            <a:graphic xmlns:a="http://schemas.openxmlformats.org/drawingml/2006/main">
+              <a:graphicData uri="http://schemas.openxmlformats.org/drawingml/2006/picture">
+                <pic:pic xmlns:pic="http://schemas.openxmlformats.org/drawingml/2006/picture">
+                  <pic:nvPicPr>
+                    <pic:cNvPr id="1" name="Снимок экрана 2026-07-14 100635.png"/>
+                    <pic:cNvPicPr/>
+                  </pic:nvPicPr>
+                  <pic:blipFill>
+                    <a:blip r:embed="rId15">
+                      <a:extLst>
+                        <a:ext uri="{28A0092B-C50C-407E-A947-70E740481C1C}">
+                          <a14:useLocalDpi xmlns:a14="http://schemas.microsoft.com/office/drawing/2010/main" val="0"/>
+                        </a:ext>
+                      </a:extLst>
+                    </a:blip>
+                    <a:stretch>
+                      <a:fillRect/>
+                    </a:stretch>
+                  </pic:blipFill>
+                  <pic:spPr>
+                    <a:xfrm>
+                      <a:off x="0" y="0"/>
+                      <a:ext cx="5734850" cy="4029637"/>
+                    </a:xfrm>
+                    <a:prstGeom prst="rect">
+                      <a:avLst/>
+                    </a:prstGeom>
+                  </pic:spPr>
+                </pic:pic>
+              </a:graphicData>
+            </a:graphic>
+          </wp:inline>
+        </w:drawing>
+      </w:r>
+    </w:p>
+    <w:p>
+      <w:pPr>
+        <w:pStyle w:val="a"/>
+        <w:numPr>
+          <w:ilvl w:val="0"/>
+          <w:numId w:val="0"/>
+        </w:numPr>
+        <w:jc w:val="center"/>
+      </w:pPr>
+      <w:r>
+        <w:t xml:space="preserve">Рисунок А2 – </w:t>
+      </w:r>
+      <w:r>
+        <w:t>Ручной ввод графа</w:t>
+      </w:r>
+    </w:p>
+    <w:p>
+      <w:pPr>
+        <w:pStyle w:val="a"/>
+        <w:numPr>
+          <w:ilvl w:val="0"/>
+          <w:numId w:val="0"/>
+        </w:numPr>
+        <w:jc w:val="center"/>
+      </w:pPr>
+      <w:r>
+        <w:rPr>
+          <w:noProof/>
+          <w:lang w:eastAsia="ru-RU" w:bidi="ar-SA"/>
+        </w:rPr>
+        <w:lastRenderedPageBreak/>
+        <w:drawing>
+          <wp:inline distT="0" distB="0" distL="0" distR="0" wp14:anchorId="241A80D5" wp14:editId="223BEFBC">
+            <wp:extent cx="3305636" cy="1105054"/>
+            <wp:effectExtent l="0" t="0" r="9525" b="0"/>
+            <wp:docPr id="2" name="Рисунок 2"/>
+            <wp:cNvGraphicFramePr>
+              <a:graphicFrameLocks xmlns:a="http://schemas.openxmlformats.org/drawingml/2006/main" noChangeAspect="1"/>
+            </wp:cNvGraphicFramePr>
+            <a:graphic xmlns:a="http://schemas.openxmlformats.org/drawingml/2006/main">
+              <a:graphicData uri="http://schemas.openxmlformats.org/drawingml/2006/picture">
+                <pic:pic xmlns:pic="http://schemas.openxmlformats.org/drawingml/2006/picture">
+                  <pic:nvPicPr>
+                    <pic:cNvPr id="2" name="Снимок экрана 2026-07-14 100618.png"/>
+                    <pic:cNvPicPr/>
+                  </pic:nvPicPr>
+                  <pic:blipFill>
+                    <a:blip r:embed="rId16">
+                      <a:extLst>
+                        <a:ext uri="{28A0092B-C50C-407E-A947-70E740481C1C}">
+                          <a14:useLocalDpi xmlns:a14="http://schemas.microsoft.com/office/drawing/2010/main" val="0"/>
+                        </a:ext>
+                      </a:extLst>
+                    </a:blip>
+                    <a:stretch>
+                      <a:fillRect/>
+                    </a:stretch>
+                  </pic:blipFill>
+                  <pic:spPr>
+                    <a:xfrm>
+                      <a:off x="0" y="0"/>
+                      <a:ext cx="3305636" cy="1105054"/>
+                    </a:xfrm>
+                    <a:prstGeom prst="rect">
+                      <a:avLst/>
+                    </a:prstGeom>
+                  </pic:spPr>
+                </pic:pic>
+              </a:graphicData>
+            </a:graphic>
+          </wp:inline>
+        </w:drawing>
+      </w:r>
+    </w:p>
+    <w:p>
+      <w:pPr>
+        <w:pStyle w:val="a"/>
+        <w:numPr>
+          <w:ilvl w:val="0"/>
+          <w:numId w:val="0"/>
+        </w:numPr>
+        <w:jc w:val="center"/>
+      </w:pPr>
+      <w:r>
+        <w:t>Рисунок А3 – Случайная генерация графа по заданным параметрам</w:t>
+      </w:r>
+      <w:bookmarkStart w:id="45" w:name="_GoBack"/>
+      <w:bookmarkEnd w:id="45"/>
+    </w:p>
     <w:sectPr>
-      <w:footerReference w:type="even" r:id="rId15"/>
-      <w:footerReference w:type="default" r:id="rId16"/>
-      <w:footerReference w:type="first" r:id="rId17"/>
+      <w:footerReference w:type="even" r:id="rId17"/>
+      <w:footerReference w:type="default" r:id="rId18"/>
+      <w:footerReference w:type="first" r:id="rId19"/>
       <w:pgSz w:w="11906" w:h="16838"/>
       <w:pgMar w:top="1134" w:right="850" w:bottom="1134" w:left="1701" w:header="0" w:footer="708" w:gutter="0"/>
       <w:cols w:space="720"/>
@@ -9180,7 +9336,7 @@
         <w:rStyle w:val="a6"/>
         <w:noProof/>
       </w:rPr>
-      <w:t>31</w:t>
+      <w:t>32</w:t>
     </w:r>
     <w:r>
       <w:rPr>
@@ -12904,7 +13060,7 @@
 </file>
 
 <file path=customXml/itemProps1.xml><?xml version="1.0" encoding="utf-8"?>
-<ds:datastoreItem xmlns:ds="http://schemas.openxmlformats.org/officeDocument/2006/customXml" ds:itemID="{72A03452-89E0-4889-AB3C-F1ACCD18D0BD}">
+<ds:datastoreItem xmlns:ds="http://schemas.openxmlformats.org/officeDocument/2006/customXml" ds:itemID="{A9CD1B60-25BD-4E85-BBB8-E99E4EA53CA7}">
   <ds:schemaRefs>
     <ds:schemaRef ds:uri="http://schemas.openxmlformats.org/officeDocument/2006/bibliography"/>
   </ds:schemaRefs>

</xml_diff>

<commit_message>
Add git link to report
</commit_message>
<xml_diff>
--- a/Report.docx
+++ b/Report.docx
@@ -2013,64 +2013,111 @@
             </w:rPr>
             <w:fldChar w:fldCharType="separate"/>
           </w:r>
-          <w:hyperlink w:anchor="_Toc235105910" w:history="1">
-            <w:r>
-              <w:rPr>
-                <w:rStyle w:val="a7"/>
-                <w:rFonts w:cs="Times New Roman"/>
-                <w:noProof/>
-              </w:rPr>
-              <w:t>ВВЕДЕНИЕ</w:t>
-            </w:r>
-            <w:r>
-              <w:rPr>
-                <w:noProof/>
-                <w:webHidden/>
-              </w:rPr>
-              <w:tab/>
-            </w:r>
-            <w:r>
-              <w:rPr>
-                <w:noProof/>
-                <w:webHidden/>
-              </w:rPr>
-              <w:fldChar w:fldCharType="begin"/>
-            </w:r>
-            <w:r>
-              <w:rPr>
-                <w:noProof/>
-                <w:webHidden/>
-              </w:rPr>
-              <w:instrText xml:space="preserve"> PAGEREF _Toc235105910 \h </w:instrText>
-            </w:r>
-            <w:r>
-              <w:rPr>
-                <w:noProof/>
-                <w:webHidden/>
-              </w:rPr>
-            </w:r>
-            <w:r>
-              <w:rPr>
-                <w:noProof/>
-                <w:webHidden/>
-              </w:rPr>
-              <w:fldChar w:fldCharType="separate"/>
-            </w:r>
-            <w:r>
-              <w:rPr>
-                <w:noProof/>
-                <w:webHidden/>
-              </w:rPr>
-              <w:t>6</w:t>
-            </w:r>
-            <w:r>
-              <w:rPr>
-                <w:noProof/>
-                <w:webHidden/>
-              </w:rPr>
-              <w:fldChar w:fldCharType="end"/>
-            </w:r>
-          </w:hyperlink>
+          <w:bookmarkStart w:id="0" w:name="_GoBack"/>
+          <w:bookmarkEnd w:id="0"/>
+          <w:r>
+            <w:rPr>
+              <w:rStyle w:val="a7"/>
+              <w:noProof/>
+            </w:rPr>
+            <w:fldChar w:fldCharType="begin"/>
+          </w:r>
+          <w:r>
+            <w:rPr>
+              <w:rStyle w:val="a7"/>
+              <w:noProof/>
+            </w:rPr>
+            <w:instrText xml:space="preserve"> </w:instrText>
+          </w:r>
+          <w:r>
+            <w:rPr>
+              <w:noProof/>
+            </w:rPr>
+            <w:instrText>HYPERLINK \l "_Toc235173114"</w:instrText>
+          </w:r>
+          <w:r>
+            <w:rPr>
+              <w:rStyle w:val="a7"/>
+              <w:noProof/>
+            </w:rPr>
+            <w:instrText xml:space="preserve"> </w:instrText>
+          </w:r>
+          <w:r>
+            <w:rPr>
+              <w:rStyle w:val="a7"/>
+              <w:noProof/>
+            </w:rPr>
+          </w:r>
+          <w:r>
+            <w:rPr>
+              <w:rStyle w:val="a7"/>
+              <w:noProof/>
+            </w:rPr>
+            <w:fldChar w:fldCharType="separate"/>
+          </w:r>
+          <w:r>
+            <w:rPr>
+              <w:rStyle w:val="a7"/>
+              <w:rFonts w:cs="Times New Roman"/>
+              <w:noProof/>
+            </w:rPr>
+            <w:t>ВВЕДЕНИЕ</w:t>
+          </w:r>
+          <w:r>
+            <w:rPr>
+              <w:noProof/>
+              <w:webHidden/>
+            </w:rPr>
+            <w:tab/>
+          </w:r>
+          <w:r>
+            <w:rPr>
+              <w:noProof/>
+              <w:webHidden/>
+            </w:rPr>
+            <w:fldChar w:fldCharType="begin"/>
+          </w:r>
+          <w:r>
+            <w:rPr>
+              <w:noProof/>
+              <w:webHidden/>
+            </w:rPr>
+            <w:instrText xml:space="preserve"> PAGEREF _Toc235173114 \h </w:instrText>
+          </w:r>
+          <w:r>
+            <w:rPr>
+              <w:noProof/>
+              <w:webHidden/>
+            </w:rPr>
+          </w:r>
+          <w:r>
+            <w:rPr>
+              <w:noProof/>
+              <w:webHidden/>
+            </w:rPr>
+            <w:fldChar w:fldCharType="separate"/>
+          </w:r>
+          <w:r>
+            <w:rPr>
+              <w:noProof/>
+              <w:webHidden/>
+            </w:rPr>
+            <w:t>6</w:t>
+          </w:r>
+          <w:r>
+            <w:rPr>
+              <w:noProof/>
+              <w:webHidden/>
+            </w:rPr>
+            <w:fldChar w:fldCharType="end"/>
+          </w:r>
+          <w:r>
+            <w:rPr>
+              <w:rStyle w:val="a7"/>
+              <w:noProof/>
+            </w:rPr>
+            <w:fldChar w:fldCharType="end"/>
+          </w:r>
         </w:p>
         <w:p>
           <w:pPr>
@@ -2083,7 +2130,7 @@
               <w:lang w:eastAsia="ru-RU" w:bidi="ar-SA"/>
             </w:rPr>
           </w:pPr>
-          <w:hyperlink w:anchor="_Toc235105911" w:history="1">
+          <w:hyperlink w:anchor="_Toc235173115" w:history="1">
             <w:r>
               <w:rPr>
                 <w:rStyle w:val="a7"/>
@@ -2110,7 +2157,7 @@
                 <w:noProof/>
                 <w:webHidden/>
               </w:rPr>
-              <w:instrText xml:space="preserve"> PAGEREF _Toc235105911 \h </w:instrText>
+              <w:instrText xml:space="preserve"> PAGEREF _Toc235173115 \h </w:instrText>
             </w:r>
             <w:r>
               <w:rPr>
@@ -2152,7 +2199,7 @@
               <w:lang w:eastAsia="ru-RU" w:bidi="ar-SA"/>
             </w:rPr>
           </w:pPr>
-          <w:hyperlink w:anchor="_Toc235105912" w:history="1">
+          <w:hyperlink w:anchor="_Toc235173116" w:history="1">
             <w:r>
               <w:rPr>
                 <w:rStyle w:val="a7"/>
@@ -2179,7 +2226,7 @@
                 <w:noProof/>
                 <w:webHidden/>
               </w:rPr>
-              <w:instrText xml:space="preserve"> PAGEREF _Toc235105912 \h </w:instrText>
+              <w:instrText xml:space="preserve"> PAGEREF _Toc235173116 \h </w:instrText>
             </w:r>
             <w:r>
               <w:rPr>
@@ -2221,7 +2268,7 @@
               <w:lang w:eastAsia="ru-RU" w:bidi="ar-SA"/>
             </w:rPr>
           </w:pPr>
-          <w:hyperlink w:anchor="_Toc235105913" w:history="1">
+          <w:hyperlink w:anchor="_Toc235173117" w:history="1">
             <w:r>
               <w:rPr>
                 <w:rStyle w:val="a7"/>
@@ -2248,7 +2295,7 @@
                 <w:noProof/>
                 <w:webHidden/>
               </w:rPr>
-              <w:instrText xml:space="preserve"> PAGEREF _Toc235105913 \h </w:instrText>
+              <w:instrText xml:space="preserve"> PAGEREF _Toc235173117 \h </w:instrText>
             </w:r>
             <w:r>
               <w:rPr>
@@ -2293,7 +2340,7 @@
               <w:lang w:eastAsia="ru-RU" w:bidi="ar-SA"/>
             </w:rPr>
           </w:pPr>
-          <w:hyperlink w:anchor="_Toc235105914" w:history="1">
+          <w:hyperlink w:anchor="_Toc235173118" w:history="1">
             <w:r>
               <w:rPr>
                 <w:rStyle w:val="a7"/>
@@ -2320,7 +2367,7 @@
                 <w:noProof/>
                 <w:webHidden/>
               </w:rPr>
-              <w:instrText xml:space="preserve"> PAGEREF _Toc235105914 \h </w:instrText>
+              <w:instrText xml:space="preserve"> PAGEREF _Toc235173118 \h </w:instrText>
             </w:r>
             <w:r>
               <w:rPr>
@@ -2365,7 +2412,7 @@
               <w:lang w:eastAsia="ru-RU" w:bidi="ar-SA"/>
             </w:rPr>
           </w:pPr>
-          <w:hyperlink w:anchor="_Toc235105915" w:history="1">
+          <w:hyperlink w:anchor="_Toc235173119" w:history="1">
             <w:r>
               <w:rPr>
                 <w:rStyle w:val="a7"/>
@@ -2392,7 +2439,7 @@
                 <w:noProof/>
                 <w:webHidden/>
               </w:rPr>
-              <w:instrText xml:space="preserve"> PAGEREF _Toc235105915 \h </w:instrText>
+              <w:instrText xml:space="preserve"> PAGEREF _Toc235173119 \h </w:instrText>
             </w:r>
             <w:r>
               <w:rPr>
@@ -2437,7 +2484,7 @@
               <w:lang w:eastAsia="ru-RU" w:bidi="ar-SA"/>
             </w:rPr>
           </w:pPr>
-          <w:hyperlink w:anchor="_Toc235105916" w:history="1">
+          <w:hyperlink w:anchor="_Toc235173120" w:history="1">
             <w:r>
               <w:rPr>
                 <w:rStyle w:val="a7"/>
@@ -2464,7 +2511,7 @@
                 <w:noProof/>
                 <w:webHidden/>
               </w:rPr>
-              <w:instrText xml:space="preserve"> PAGEREF _Toc235105916 \h </w:instrText>
+              <w:instrText xml:space="preserve"> PAGEREF _Toc235173120 \h </w:instrText>
             </w:r>
             <w:r>
               <w:rPr>
@@ -2509,7 +2556,7 @@
               <w:lang w:eastAsia="ru-RU" w:bidi="ar-SA"/>
             </w:rPr>
           </w:pPr>
-          <w:hyperlink w:anchor="_Toc235105917" w:history="1">
+          <w:hyperlink w:anchor="_Toc235173121" w:history="1">
             <w:r>
               <w:rPr>
                 <w:rStyle w:val="a7"/>
@@ -2536,7 +2583,7 @@
                 <w:noProof/>
                 <w:webHidden/>
               </w:rPr>
-              <w:instrText xml:space="preserve"> PAGEREF _Toc235105917 \h </w:instrText>
+              <w:instrText xml:space="preserve"> PAGEREF _Toc235173121 \h </w:instrText>
             </w:r>
             <w:r>
               <w:rPr>
@@ -2581,7 +2628,7 @@
               <w:lang w:eastAsia="ru-RU" w:bidi="ar-SA"/>
             </w:rPr>
           </w:pPr>
-          <w:hyperlink w:anchor="_Toc235105918" w:history="1">
+          <w:hyperlink w:anchor="_Toc235173122" w:history="1">
             <w:r>
               <w:rPr>
                 <w:rStyle w:val="a7"/>
@@ -2608,7 +2655,7 @@
                 <w:noProof/>
                 <w:webHidden/>
               </w:rPr>
-              <w:instrText xml:space="preserve"> PAGEREF _Toc235105918 \h </w:instrText>
+              <w:instrText xml:space="preserve"> PAGEREF _Toc235173122 \h </w:instrText>
             </w:r>
             <w:r>
               <w:rPr>
@@ -2653,7 +2700,7 @@
               <w:lang w:eastAsia="ru-RU" w:bidi="ar-SA"/>
             </w:rPr>
           </w:pPr>
-          <w:hyperlink w:anchor="_Toc235105919" w:history="1">
+          <w:hyperlink w:anchor="_Toc235173123" w:history="1">
             <w:r>
               <w:rPr>
                 <w:rStyle w:val="a7"/>
@@ -2680,7 +2727,7 @@
                 <w:noProof/>
                 <w:webHidden/>
               </w:rPr>
-              <w:instrText xml:space="preserve"> PAGEREF _Toc235105919 \h </w:instrText>
+              <w:instrText xml:space="preserve"> PAGEREF _Toc235173123 \h </w:instrText>
             </w:r>
             <w:r>
               <w:rPr>
@@ -2722,7 +2769,7 @@
               <w:lang w:eastAsia="ru-RU" w:bidi="ar-SA"/>
             </w:rPr>
           </w:pPr>
-          <w:hyperlink w:anchor="_Toc235105920" w:history="1">
+          <w:hyperlink w:anchor="_Toc235173124" w:history="1">
             <w:r>
               <w:rPr>
                 <w:rStyle w:val="a7"/>
@@ -2749,7 +2796,7 @@
                 <w:noProof/>
                 <w:webHidden/>
               </w:rPr>
-              <w:instrText xml:space="preserve"> PAGEREF _Toc235105920 \h </w:instrText>
+              <w:instrText xml:space="preserve"> PAGEREF _Toc235173124 \h </w:instrText>
             </w:r>
             <w:r>
               <w:rPr>
@@ -2791,7 +2838,7 @@
               <w:lang w:eastAsia="ru-RU" w:bidi="ar-SA"/>
             </w:rPr>
           </w:pPr>
-          <w:hyperlink w:anchor="_Toc235105921" w:history="1">
+          <w:hyperlink w:anchor="_Toc235173125" w:history="1">
             <w:r>
               <w:rPr>
                 <w:rStyle w:val="a7"/>
@@ -2818,7 +2865,7 @@
                 <w:noProof/>
                 <w:webHidden/>
               </w:rPr>
-              <w:instrText xml:space="preserve"> PAGEREF _Toc235105921 \h </w:instrText>
+              <w:instrText xml:space="preserve"> PAGEREF _Toc235173125 \h </w:instrText>
             </w:r>
             <w:r>
               <w:rPr>
@@ -2860,7 +2907,7 @@
               <w:lang w:eastAsia="ru-RU" w:bidi="ar-SA"/>
             </w:rPr>
           </w:pPr>
-          <w:hyperlink w:anchor="_Toc235105922" w:history="1">
+          <w:hyperlink w:anchor="_Toc235173126" w:history="1">
             <w:r>
               <w:rPr>
                 <w:rStyle w:val="a7"/>
@@ -2887,7 +2934,7 @@
                 <w:noProof/>
                 <w:webHidden/>
               </w:rPr>
-              <w:instrText xml:space="preserve"> PAGEREF _Toc235105922 \h </w:instrText>
+              <w:instrText xml:space="preserve"> PAGEREF _Toc235173126 \h </w:instrText>
             </w:r>
             <w:r>
               <w:rPr>
@@ -2929,7 +2976,7 @@
               <w:lang w:eastAsia="ru-RU" w:bidi="ar-SA"/>
             </w:rPr>
           </w:pPr>
-          <w:hyperlink w:anchor="_Toc235105923" w:history="1">
+          <w:hyperlink w:anchor="_Toc235173127" w:history="1">
             <w:r>
               <w:rPr>
                 <w:rStyle w:val="a7"/>
@@ -2956,7 +3003,7 @@
                 <w:noProof/>
                 <w:webHidden/>
               </w:rPr>
-              <w:instrText xml:space="preserve"> PAGEREF _Toc235105923 \h </w:instrText>
+              <w:instrText xml:space="preserve"> PAGEREF _Toc235173127 \h </w:instrText>
             </w:r>
             <w:r>
               <w:rPr>
@@ -3001,7 +3048,7 @@
               <w:lang w:eastAsia="ru-RU" w:bidi="ar-SA"/>
             </w:rPr>
           </w:pPr>
-          <w:hyperlink w:anchor="_Toc235105924" w:history="1">
+          <w:hyperlink w:anchor="_Toc235173128" w:history="1">
             <w:r>
               <w:rPr>
                 <w:rStyle w:val="a7"/>
@@ -3028,7 +3075,7 @@
                 <w:noProof/>
                 <w:webHidden/>
               </w:rPr>
-              <w:instrText xml:space="preserve"> PAGEREF _Toc235105924 \h </w:instrText>
+              <w:instrText xml:space="preserve"> PAGEREF _Toc235173128 \h </w:instrText>
             </w:r>
             <w:r>
               <w:rPr>
@@ -3073,7 +3120,7 @@
               <w:lang w:eastAsia="ru-RU" w:bidi="ar-SA"/>
             </w:rPr>
           </w:pPr>
-          <w:hyperlink w:anchor="_Toc235105925" w:history="1">
+          <w:hyperlink w:anchor="_Toc235173129" w:history="1">
             <w:r>
               <w:rPr>
                 <w:rStyle w:val="a7"/>
@@ -3100,7 +3147,7 @@
                 <w:noProof/>
                 <w:webHidden/>
               </w:rPr>
-              <w:instrText xml:space="preserve"> PAGEREF _Toc235105925 \h </w:instrText>
+              <w:instrText xml:space="preserve"> PAGEREF _Toc235173129 \h </w:instrText>
             </w:r>
             <w:r>
               <w:rPr>
@@ -3145,7 +3192,7 @@
               <w:lang w:eastAsia="ru-RU" w:bidi="ar-SA"/>
             </w:rPr>
           </w:pPr>
-          <w:hyperlink w:anchor="_Toc235105926" w:history="1">
+          <w:hyperlink w:anchor="_Toc235173130" w:history="1">
             <w:r>
               <w:rPr>
                 <w:rStyle w:val="a7"/>
@@ -3172,7 +3219,7 @@
                 <w:noProof/>
                 <w:webHidden/>
               </w:rPr>
-              <w:instrText xml:space="preserve"> PAGEREF _Toc235105926 \h </w:instrText>
+              <w:instrText xml:space="preserve"> PAGEREF _Toc235173130 \h </w:instrText>
             </w:r>
             <w:r>
               <w:rPr>
@@ -3217,7 +3264,7 @@
               <w:lang w:eastAsia="ru-RU" w:bidi="ar-SA"/>
             </w:rPr>
           </w:pPr>
-          <w:hyperlink w:anchor="_Toc235105927" w:history="1">
+          <w:hyperlink w:anchor="_Toc235173131" w:history="1">
             <w:r>
               <w:rPr>
                 <w:rStyle w:val="a7"/>
@@ -3244,7 +3291,7 @@
                 <w:noProof/>
                 <w:webHidden/>
               </w:rPr>
-              <w:instrText xml:space="preserve"> PAGEREF _Toc235105927 \h </w:instrText>
+              <w:instrText xml:space="preserve"> PAGEREF _Toc235173131 \h </w:instrText>
             </w:r>
             <w:r>
               <w:rPr>
@@ -3289,7 +3336,7 @@
               <w:lang w:eastAsia="ru-RU" w:bidi="ar-SA"/>
             </w:rPr>
           </w:pPr>
-          <w:hyperlink w:anchor="_Toc235105928" w:history="1">
+          <w:hyperlink w:anchor="_Toc235173132" w:history="1">
             <w:r>
               <w:rPr>
                 <w:rStyle w:val="a7"/>
@@ -3316,7 +3363,7 @@
                 <w:noProof/>
                 <w:webHidden/>
               </w:rPr>
-              <w:instrText xml:space="preserve"> PAGEREF _Toc235105928 \h </w:instrText>
+              <w:instrText xml:space="preserve"> PAGEREF _Toc235173132 \h </w:instrText>
             </w:r>
             <w:r>
               <w:rPr>
@@ -3361,7 +3408,7 @@
               <w:lang w:eastAsia="ru-RU" w:bidi="ar-SA"/>
             </w:rPr>
           </w:pPr>
-          <w:hyperlink w:anchor="_Toc235105929" w:history="1">
+          <w:hyperlink w:anchor="_Toc235173133" w:history="1">
             <w:r>
               <w:rPr>
                 <w:rStyle w:val="a7"/>
@@ -3388,7 +3435,7 @@
                 <w:noProof/>
                 <w:webHidden/>
               </w:rPr>
-              <w:instrText xml:space="preserve"> PAGEREF _Toc235105929 \h </w:instrText>
+              <w:instrText xml:space="preserve"> PAGEREF _Toc235173133 \h </w:instrText>
             </w:r>
             <w:r>
               <w:rPr>
@@ -3433,7 +3480,7 @@
               <w:lang w:eastAsia="ru-RU" w:bidi="ar-SA"/>
             </w:rPr>
           </w:pPr>
-          <w:hyperlink w:anchor="_Toc235105930" w:history="1">
+          <w:hyperlink w:anchor="_Toc235173134" w:history="1">
             <w:r>
               <w:rPr>
                 <w:rStyle w:val="a7"/>
@@ -3460,7 +3507,7 @@
                 <w:noProof/>
                 <w:webHidden/>
               </w:rPr>
-              <w:instrText xml:space="preserve"> PAGEREF _Toc235105930 \h </w:instrText>
+              <w:instrText xml:space="preserve"> PAGEREF _Toc235173134 \h </w:instrText>
             </w:r>
             <w:r>
               <w:rPr>
@@ -3505,7 +3552,7 @@
               <w:lang w:eastAsia="ru-RU" w:bidi="ar-SA"/>
             </w:rPr>
           </w:pPr>
-          <w:hyperlink w:anchor="_Toc235105931" w:history="1">
+          <w:hyperlink w:anchor="_Toc235173135" w:history="1">
             <w:r>
               <w:rPr>
                 <w:rStyle w:val="a7"/>
@@ -3532,7 +3579,7 @@
                 <w:noProof/>
                 <w:webHidden/>
               </w:rPr>
-              <w:instrText xml:space="preserve"> PAGEREF _Toc235105931 \h </w:instrText>
+              <w:instrText xml:space="preserve"> PAGEREF _Toc235173135 \h </w:instrText>
             </w:r>
             <w:r>
               <w:rPr>
@@ -3574,7 +3621,7 @@
               <w:lang w:eastAsia="ru-RU" w:bidi="ar-SA"/>
             </w:rPr>
           </w:pPr>
-          <w:hyperlink w:anchor="_Toc235105932" w:history="1">
+          <w:hyperlink w:anchor="_Toc235173136" w:history="1">
             <w:r>
               <w:rPr>
                 <w:rStyle w:val="a7"/>
@@ -3616,7 +3663,7 @@
                 <w:noProof/>
                 <w:webHidden/>
               </w:rPr>
-              <w:instrText xml:space="preserve"> PAGEREF _Toc235105932 \h </w:instrText>
+              <w:instrText xml:space="preserve"> PAGEREF _Toc235173136 \h </w:instrText>
             </w:r>
             <w:r>
               <w:rPr>
@@ -3661,7 +3708,7 @@
               <w:lang w:eastAsia="ru-RU" w:bidi="ar-SA"/>
             </w:rPr>
           </w:pPr>
-          <w:hyperlink w:anchor="_Toc235105933" w:history="1">
+          <w:hyperlink w:anchor="_Toc235173137" w:history="1">
             <w:r>
               <w:rPr>
                 <w:rStyle w:val="a7"/>
@@ -3688,7 +3735,7 @@
                 <w:noProof/>
                 <w:webHidden/>
               </w:rPr>
-              <w:instrText xml:space="preserve"> PAGEREF _Toc235105933 \h </w:instrText>
+              <w:instrText xml:space="preserve"> PAGEREF _Toc235173137 \h </w:instrText>
             </w:r>
             <w:r>
               <w:rPr>
@@ -3733,7 +3780,7 @@
               <w:lang w:eastAsia="ru-RU" w:bidi="ar-SA"/>
             </w:rPr>
           </w:pPr>
-          <w:hyperlink w:anchor="_Toc235105934" w:history="1">
+          <w:hyperlink w:anchor="_Toc235173138" w:history="1">
             <w:r>
               <w:rPr>
                 <w:rStyle w:val="a7"/>
@@ -3760,7 +3807,7 @@
                 <w:noProof/>
                 <w:webHidden/>
               </w:rPr>
-              <w:instrText xml:space="preserve"> PAGEREF _Toc235105934 \h </w:instrText>
+              <w:instrText xml:space="preserve"> PAGEREF _Toc235173138 \h </w:instrText>
             </w:r>
             <w:r>
               <w:rPr>
@@ -3805,7 +3852,7 @@
               <w:lang w:eastAsia="ru-RU" w:bidi="ar-SA"/>
             </w:rPr>
           </w:pPr>
-          <w:hyperlink w:anchor="_Toc235105935" w:history="1">
+          <w:hyperlink w:anchor="_Toc235173139" w:history="1">
             <w:r>
               <w:rPr>
                 <w:rStyle w:val="a7"/>
@@ -3832,7 +3879,7 @@
                 <w:noProof/>
                 <w:webHidden/>
               </w:rPr>
-              <w:instrText xml:space="preserve"> PAGEREF _Toc235105935 \h </w:instrText>
+              <w:instrText xml:space="preserve"> PAGEREF _Toc235173139 \h </w:instrText>
             </w:r>
             <w:r>
               <w:rPr>
@@ -3877,7 +3924,7 @@
               <w:lang w:eastAsia="ru-RU" w:bidi="ar-SA"/>
             </w:rPr>
           </w:pPr>
-          <w:hyperlink w:anchor="_Toc235105936" w:history="1">
+          <w:hyperlink w:anchor="_Toc235173140" w:history="1">
             <w:r>
               <w:rPr>
                 <w:rStyle w:val="a7"/>
@@ -3904,7 +3951,7 @@
                 <w:noProof/>
                 <w:webHidden/>
               </w:rPr>
-              <w:instrText xml:space="preserve"> PAGEREF _Toc235105936 \h </w:instrText>
+              <w:instrText xml:space="preserve"> PAGEREF _Toc235173140 \h </w:instrText>
             </w:r>
             <w:r>
               <w:rPr>
@@ -3949,7 +3996,7 @@
               <w:lang w:eastAsia="ru-RU" w:bidi="ar-SA"/>
             </w:rPr>
           </w:pPr>
-          <w:hyperlink w:anchor="_Toc235105937" w:history="1">
+          <w:hyperlink w:anchor="_Toc235173141" w:history="1">
             <w:r>
               <w:rPr>
                 <w:rStyle w:val="a7"/>
@@ -3976,7 +4023,7 @@
                 <w:noProof/>
                 <w:webHidden/>
               </w:rPr>
-              <w:instrText xml:space="preserve"> PAGEREF _Toc235105937 \h </w:instrText>
+              <w:instrText xml:space="preserve"> PAGEREF _Toc235173141 \h </w:instrText>
             </w:r>
             <w:r>
               <w:rPr>
@@ -4021,7 +4068,7 @@
               <w:lang w:eastAsia="ru-RU" w:bidi="ar-SA"/>
             </w:rPr>
           </w:pPr>
-          <w:hyperlink w:anchor="_Toc235105938" w:history="1">
+          <w:hyperlink w:anchor="_Toc235173142" w:history="1">
             <w:r>
               <w:rPr>
                 <w:rStyle w:val="a7"/>
@@ -4048,7 +4095,7 @@
                 <w:noProof/>
                 <w:webHidden/>
               </w:rPr>
-              <w:instrText xml:space="preserve"> PAGEREF _Toc235105938 \h </w:instrText>
+              <w:instrText xml:space="preserve"> PAGEREF _Toc235173142 \h </w:instrText>
             </w:r>
             <w:r>
               <w:rPr>
@@ -4090,7 +4137,7 @@
               <w:lang w:eastAsia="ru-RU" w:bidi="ar-SA"/>
             </w:rPr>
           </w:pPr>
-          <w:hyperlink w:anchor="_Toc235105939" w:history="1">
+          <w:hyperlink w:anchor="_Toc235173143" w:history="1">
             <w:r>
               <w:rPr>
                 <w:rStyle w:val="a7"/>
@@ -4117,7 +4164,7 @@
                 <w:noProof/>
                 <w:webHidden/>
               </w:rPr>
-              <w:instrText xml:space="preserve"> PAGEREF _Toc235105939 \h </w:instrText>
+              <w:instrText xml:space="preserve"> PAGEREF _Toc235173143 \h </w:instrText>
             </w:r>
             <w:r>
               <w:rPr>
@@ -4159,7 +4206,7 @@
               <w:lang w:eastAsia="ru-RU" w:bidi="ar-SA"/>
             </w:rPr>
           </w:pPr>
-          <w:hyperlink w:anchor="_Toc235105940" w:history="1">
+          <w:hyperlink w:anchor="_Toc235173144" w:history="1">
             <w:r>
               <w:rPr>
                 <w:rStyle w:val="a7"/>
@@ -4186,7 +4233,7 @@
                 <w:noProof/>
                 <w:webHidden/>
               </w:rPr>
-              <w:instrText xml:space="preserve"> PAGEREF _Toc235105940 \h </w:instrText>
+              <w:instrText xml:space="preserve"> PAGEREF _Toc235173144 \h </w:instrText>
             </w:r>
             <w:r>
               <w:rPr>
@@ -4228,7 +4275,7 @@
               <w:lang w:eastAsia="ru-RU" w:bidi="ar-SA"/>
             </w:rPr>
           </w:pPr>
-          <w:hyperlink w:anchor="_Toc235105941" w:history="1">
+          <w:hyperlink w:anchor="_Toc235173145" w:history="1">
             <w:r>
               <w:rPr>
                 <w:rStyle w:val="a7"/>
@@ -4255,7 +4302,7 @@
                 <w:noProof/>
                 <w:webHidden/>
               </w:rPr>
-              <w:instrText xml:space="preserve"> PAGEREF _Toc235105941 \h </w:instrText>
+              <w:instrText xml:space="preserve"> PAGEREF _Toc235173145 \h </w:instrText>
             </w:r>
             <w:r>
               <w:rPr>
@@ -4297,7 +4344,7 @@
               <w:lang w:eastAsia="ru-RU" w:bidi="ar-SA"/>
             </w:rPr>
           </w:pPr>
-          <w:hyperlink w:anchor="_Toc235105942" w:history="1">
+          <w:hyperlink w:anchor="_Toc235173146" w:history="1">
             <w:r>
               <w:rPr>
                 <w:rStyle w:val="a7"/>
@@ -4324,7 +4371,7 @@
                 <w:noProof/>
                 <w:webHidden/>
               </w:rPr>
-              <w:instrText xml:space="preserve"> PAGEREF _Toc235105942 \h </w:instrText>
+              <w:instrText xml:space="preserve"> PAGEREF _Toc235173146 \h </w:instrText>
             </w:r>
             <w:r>
               <w:rPr>
@@ -4366,7 +4413,7 @@
               <w:lang w:eastAsia="ru-RU" w:bidi="ar-SA"/>
             </w:rPr>
           </w:pPr>
-          <w:hyperlink w:anchor="_Toc235105943" w:history="1">
+          <w:hyperlink w:anchor="_Toc235173147" w:history="1">
             <w:r>
               <w:rPr>
                 <w:rStyle w:val="a7"/>
@@ -4393,7 +4440,7 @@
                 <w:noProof/>
                 <w:webHidden/>
               </w:rPr>
-              <w:instrText xml:space="preserve"> PAGEREF _Toc235105943 \h </w:instrText>
+              <w:instrText xml:space="preserve"> PAGEREF _Toc235173147 \h </w:instrText>
             </w:r>
             <w:r>
               <w:rPr>
@@ -4438,7 +4485,7 @@
               <w:lang w:eastAsia="ru-RU" w:bidi="ar-SA"/>
             </w:rPr>
           </w:pPr>
-          <w:hyperlink w:anchor="_Toc235105944" w:history="1">
+          <w:hyperlink w:anchor="_Toc235173148" w:history="1">
             <w:r>
               <w:rPr>
                 <w:rStyle w:val="a7"/>
@@ -4465,7 +4512,7 @@
                 <w:noProof/>
                 <w:webHidden/>
               </w:rPr>
-              <w:instrText xml:space="preserve"> PAGEREF _Toc235105944 \h </w:instrText>
+              <w:instrText xml:space="preserve"> PAGEREF _Toc235173148 \h </w:instrText>
             </w:r>
             <w:r>
               <w:rPr>
@@ -4510,7 +4557,7 @@
               <w:lang w:eastAsia="ru-RU" w:bidi="ar-SA"/>
             </w:rPr>
           </w:pPr>
-          <w:hyperlink w:anchor="_Toc235105945" w:history="1">
+          <w:hyperlink w:anchor="_Toc235173149" w:history="1">
             <w:r>
               <w:rPr>
                 <w:rStyle w:val="a7"/>
@@ -4537,7 +4584,7 @@
                 <w:noProof/>
                 <w:webHidden/>
               </w:rPr>
-              <w:instrText xml:space="preserve"> PAGEREF _Toc235105945 \h </w:instrText>
+              <w:instrText xml:space="preserve"> PAGEREF _Toc235173149 \h </w:instrText>
             </w:r>
             <w:r>
               <w:rPr>
@@ -4582,7 +4629,7 @@
               <w:lang w:eastAsia="ru-RU" w:bidi="ar-SA"/>
             </w:rPr>
           </w:pPr>
-          <w:hyperlink w:anchor="_Toc235105946" w:history="1">
+          <w:hyperlink w:anchor="_Toc235173150" w:history="1">
             <w:r>
               <w:rPr>
                 <w:rStyle w:val="a7"/>
@@ -4609,7 +4656,7 @@
                 <w:noProof/>
                 <w:webHidden/>
               </w:rPr>
-              <w:instrText xml:space="preserve"> PAGEREF _Toc235105946 \h </w:instrText>
+              <w:instrText xml:space="preserve"> PAGEREF _Toc235173150 \h </w:instrText>
             </w:r>
             <w:r>
               <w:rPr>
@@ -4651,7 +4698,7 @@
               <w:lang w:eastAsia="ru-RU" w:bidi="ar-SA"/>
             </w:rPr>
           </w:pPr>
-          <w:hyperlink w:anchor="_Toc235105947" w:history="1">
+          <w:hyperlink w:anchor="_Toc235173151" w:history="1">
             <w:r>
               <w:rPr>
                 <w:rStyle w:val="a7"/>
@@ -4678,7 +4725,7 @@
                 <w:noProof/>
                 <w:webHidden/>
               </w:rPr>
-              <w:instrText xml:space="preserve"> PAGEREF _Toc235105947 \h </w:instrText>
+              <w:instrText xml:space="preserve"> PAGEREF _Toc235173151 \h </w:instrText>
             </w:r>
             <w:r>
               <w:rPr>
@@ -4720,7 +4767,7 @@
               <w:lang w:eastAsia="ru-RU" w:bidi="ar-SA"/>
             </w:rPr>
           </w:pPr>
-          <w:hyperlink w:anchor="_Toc235105948" w:history="1">
+          <w:hyperlink w:anchor="_Toc235173152" w:history="1">
             <w:r>
               <w:rPr>
                 <w:rStyle w:val="a7"/>
@@ -4747,7 +4794,7 @@
                 <w:noProof/>
                 <w:webHidden/>
               </w:rPr>
-              <w:instrText xml:space="preserve"> PAGEREF _Toc235105948 \h </w:instrText>
+              <w:instrText xml:space="preserve"> PAGEREF _Toc235173152 \h </w:instrText>
             </w:r>
             <w:r>
               <w:rPr>
@@ -4789,7 +4836,7 @@
               <w:lang w:eastAsia="ru-RU" w:bidi="ar-SA"/>
             </w:rPr>
           </w:pPr>
-          <w:hyperlink w:anchor="_Toc235105949" w:history="1">
+          <w:hyperlink w:anchor="_Toc235173153" w:history="1">
             <w:r>
               <w:rPr>
                 <w:rStyle w:val="a7"/>
@@ -4817,7 +4864,7 @@
                 <w:noProof/>
                 <w:webHidden/>
               </w:rPr>
-              <w:instrText xml:space="preserve"> PAGEREF _Toc235105949 \h </w:instrText>
+              <w:instrText xml:space="preserve"> PAGEREF _Toc235173153 \h </w:instrText>
             </w:r>
             <w:r>
               <w:rPr>
@@ -4837,7 +4884,7 @@
                 <w:noProof/>
                 <w:webHidden/>
               </w:rPr>
-              <w:t>30</w:t>
+              <w:t>31</w:t>
             </w:r>
             <w:r>
               <w:rPr>
@@ -4859,7 +4906,7 @@
               <w:lang w:eastAsia="ru-RU" w:bidi="ar-SA"/>
             </w:rPr>
           </w:pPr>
-          <w:hyperlink w:anchor="_Toc235105950" w:history="1">
+          <w:hyperlink w:anchor="_Toc235173154" w:history="1">
             <w:r>
               <w:rPr>
                 <w:rStyle w:val="a7"/>
@@ -4887,7 +4934,7 @@
                 <w:noProof/>
                 <w:webHidden/>
               </w:rPr>
-              <w:instrText xml:space="preserve"> PAGEREF _Toc235105950 \h </w:instrText>
+              <w:instrText xml:space="preserve"> PAGEREF _Toc235173154 \h </w:instrText>
             </w:r>
             <w:r>
               <w:rPr>
@@ -4907,7 +4954,7 @@
                 <w:noProof/>
                 <w:webHidden/>
               </w:rPr>
-              <w:t>31</w:t>
+              <w:t>32</w:t>
             </w:r>
             <w:r>
               <w:rPr>
@@ -4955,7 +5002,7 @@
           <w:rFonts w:cs="Times New Roman"/>
         </w:rPr>
       </w:pPr>
-      <w:bookmarkStart w:id="0" w:name="_Toc235105910"/>
+      <w:bookmarkStart w:id="1" w:name="_Toc235173114"/>
       <w:r>
         <w:rPr>
           <w:rFonts w:cs="Times New Roman"/>
@@ -4963,7 +5010,7 @@
         <w:lastRenderedPageBreak/>
         <w:t>ВВЕДЕНИЕ</w:t>
       </w:r>
-      <w:bookmarkEnd w:id="0"/>
+      <w:bookmarkEnd w:id="1"/>
     </w:p>
     <w:p>
       <w:pPr>
@@ -5127,7 +5174,7 @@
           <w:szCs w:val="28"/>
         </w:rPr>
       </w:pPr>
-      <w:bookmarkStart w:id="1" w:name="_Toc73173348"/>
+      <w:bookmarkStart w:id="2" w:name="_Toc73173348"/>
       <w:r>
         <w:br w:type="page"/>
       </w:r>
@@ -5140,16 +5187,16 @@
           <w:numId w:val="2"/>
         </w:numPr>
       </w:pPr>
-      <w:bookmarkStart w:id="2" w:name="_Toc235105911"/>
+      <w:bookmarkStart w:id="3" w:name="_Toc235173115"/>
       <w:r>
         <w:lastRenderedPageBreak/>
         <w:t xml:space="preserve">1 </w:t>
       </w:r>
-      <w:bookmarkEnd w:id="1"/>
+      <w:bookmarkEnd w:id="2"/>
       <w:r>
         <w:t>ПОСТАНОВКА ЗАДАЧИ</w:t>
       </w:r>
-      <w:bookmarkEnd w:id="2"/>
+      <w:bookmarkEnd w:id="3"/>
     </w:p>
     <w:p>
       <w:pPr>
@@ -5159,12 +5206,12 @@
           <w:numId w:val="2"/>
         </w:numPr>
       </w:pPr>
-      <w:bookmarkStart w:id="3" w:name="_Toc235105912"/>
       <w:bookmarkStart w:id="4" w:name="_Toc73173349"/>
+      <w:bookmarkStart w:id="5" w:name="_Toc235173116"/>
       <w:r>
         <w:t>1.1 Предметная область</w:t>
       </w:r>
-      <w:bookmarkEnd w:id="3"/>
+      <w:bookmarkEnd w:id="5"/>
     </w:p>
     <w:p>
       <w:pPr>
@@ -5216,21 +5263,21 @@
           <w:numId w:val="2"/>
         </w:numPr>
       </w:pPr>
-      <w:bookmarkStart w:id="5" w:name="_Toc235105913"/>
+      <w:bookmarkStart w:id="6" w:name="_Toc235173117"/>
       <w:r>
         <w:t>1.2 Задачи практики</w:t>
       </w:r>
-      <w:bookmarkEnd w:id="5"/>
+      <w:bookmarkEnd w:id="6"/>
     </w:p>
     <w:p>
       <w:pPr>
         <w:pStyle w:val="4"/>
       </w:pPr>
-      <w:bookmarkStart w:id="6" w:name="_Toc235105914"/>
+      <w:bookmarkStart w:id="7" w:name="_Toc235173118"/>
       <w:r>
         <w:t>1.2.1 Изучение предметной области</w:t>
       </w:r>
-      <w:bookmarkEnd w:id="6"/>
+      <w:bookmarkEnd w:id="7"/>
     </w:p>
     <w:p>
       <w:pPr>
@@ -5269,7 +5316,7 @@
       <w:pPr>
         <w:pStyle w:val="4"/>
       </w:pPr>
-      <w:bookmarkStart w:id="7" w:name="_Toc235105915"/>
+      <w:bookmarkStart w:id="8" w:name="_Toc235173119"/>
       <w:r>
         <w:lastRenderedPageBreak/>
         <w:t>1.2.</w:t>
@@ -5280,7 +5327,7 @@
       <w:r>
         <w:t xml:space="preserve"> Проектирование и реализация генетического алгоритма</w:t>
       </w:r>
-      <w:bookmarkEnd w:id="7"/>
+      <w:bookmarkEnd w:id="8"/>
     </w:p>
     <w:p>
       <w:pPr>
@@ -5302,7 +5349,7 @@
       <w:pPr>
         <w:pStyle w:val="4"/>
       </w:pPr>
-      <w:bookmarkStart w:id="8" w:name="_Toc235105916"/>
+      <w:bookmarkStart w:id="9" w:name="_Toc235173120"/>
       <w:r>
         <w:t>1.2.</w:t>
       </w:r>
@@ -5312,7 +5359,7 @@
       <w:r>
         <w:t xml:space="preserve"> Проектирование структуры хранения графа и генерации входных данных</w:t>
       </w:r>
-      <w:bookmarkEnd w:id="8"/>
+      <w:bookmarkEnd w:id="9"/>
     </w:p>
     <w:p>
       <w:pPr>
@@ -5334,7 +5381,7 @@
       <w:pPr>
         <w:pStyle w:val="4"/>
       </w:pPr>
-      <w:bookmarkStart w:id="9" w:name="_Toc235105917"/>
+      <w:bookmarkStart w:id="10" w:name="_Toc235173121"/>
       <w:r>
         <w:t>1.2.</w:t>
       </w:r>
@@ -5344,7 +5391,7 @@
       <w:r>
         <w:t xml:space="preserve"> Проектирование и разработка графического интерфейса</w:t>
       </w:r>
-      <w:bookmarkEnd w:id="9"/>
+      <w:bookmarkEnd w:id="10"/>
     </w:p>
     <w:p>
       <w:pPr>
@@ -5366,7 +5413,7 @@
       <w:pPr>
         <w:pStyle w:val="4"/>
       </w:pPr>
-      <w:bookmarkStart w:id="10" w:name="_Toc235105918"/>
+      <w:bookmarkStart w:id="11" w:name="_Toc235173122"/>
       <w:r>
         <w:t>1.2.</w:t>
       </w:r>
@@ -5376,7 +5423,7 @@
       <w:r>
         <w:t xml:space="preserve"> Интеграция компонентов программного комплекса</w:t>
       </w:r>
-      <w:bookmarkEnd w:id="10"/>
+      <w:bookmarkEnd w:id="11"/>
     </w:p>
     <w:p>
       <w:pPr>
@@ -5407,7 +5454,7 @@
       <w:pPr>
         <w:pStyle w:val="4"/>
       </w:pPr>
-      <w:bookmarkStart w:id="11" w:name="_Toc235105919"/>
+      <w:bookmarkStart w:id="12" w:name="_Toc235173123"/>
       <w:r>
         <w:t>1.2.</w:t>
       </w:r>
@@ -5420,7 +5467,7 @@
       <w:r>
         <w:t>Анализ результатов</w:t>
       </w:r>
-      <w:bookmarkEnd w:id="11"/>
+      <w:bookmarkEnd w:id="12"/>
     </w:p>
     <w:p>
       <w:pPr>
@@ -5457,19 +5504,19 @@
         <w:pStyle w:val="2"/>
         <w:ind w:left="0"/>
       </w:pPr>
-      <w:bookmarkStart w:id="12" w:name="_Toc235105920"/>
+      <w:bookmarkStart w:id="13" w:name="_Toc235173124"/>
       <w:r>
         <w:lastRenderedPageBreak/>
         <w:t>2 РЕЗУЛЬТАТЫ РАБОТЫ</w:t>
       </w:r>
-      <w:bookmarkEnd w:id="12"/>
+      <w:bookmarkEnd w:id="13"/>
     </w:p>
     <w:p>
       <w:pPr>
         <w:pStyle w:val="3"/>
         <w:ind w:left="0"/>
       </w:pPr>
-      <w:bookmarkStart w:id="13" w:name="_Toc235105921"/>
+      <w:bookmarkStart w:id="14" w:name="_Toc235173125"/>
       <w:r>
         <w:t>2.</w:t>
       </w:r>
@@ -5482,7 +5529,7 @@
       <w:r>
         <w:t xml:space="preserve"> формата хранения графа</w:t>
       </w:r>
-      <w:bookmarkEnd w:id="13"/>
+      <w:bookmarkEnd w:id="14"/>
     </w:p>
     <w:p>
       <w:pPr>
@@ -5821,7 +5868,7 @@
         <w:pStyle w:val="3"/>
         <w:ind w:left="0"/>
       </w:pPr>
-      <w:bookmarkStart w:id="14" w:name="_Toc235105922"/>
+      <w:bookmarkStart w:id="15" w:name="_Toc235173126"/>
       <w:r>
         <w:t>2.</w:t>
       </w:r>
@@ -5831,7 +5878,7 @@
       <w:r>
         <w:t xml:space="preserve"> Генерация случайного графа</w:t>
       </w:r>
-      <w:bookmarkEnd w:id="14"/>
+      <w:bookmarkEnd w:id="15"/>
     </w:p>
     <w:p>
       <w:pPr>
@@ -5962,7 +6009,7 @@
           <w:numId w:val="2"/>
         </w:numPr>
       </w:pPr>
-      <w:bookmarkStart w:id="15" w:name="_Toc235105923"/>
+      <w:bookmarkStart w:id="16" w:name="_Toc235173127"/>
       <w:r>
         <w:t>2</w:t>
       </w:r>
@@ -5978,7 +6025,7 @@
       <w:r>
         <w:t>Проектирование программного решения для генетического алгоритма</w:t>
       </w:r>
-      <w:bookmarkEnd w:id="15"/>
+      <w:bookmarkEnd w:id="16"/>
     </w:p>
     <w:p>
       <w:pPr>
@@ -6013,7 +6060,7 @@
       <w:pPr>
         <w:pStyle w:val="4"/>
       </w:pPr>
-      <w:bookmarkStart w:id="16" w:name="_Toc235105924"/>
+      <w:bookmarkStart w:id="17" w:name="_Toc235173128"/>
       <w:r>
         <w:t>2.</w:t>
       </w:r>
@@ -6023,7 +6070,7 @@
       <w:r>
         <w:t>.1 Представление особи</w:t>
       </w:r>
-      <w:bookmarkEnd w:id="16"/>
+      <w:bookmarkEnd w:id="17"/>
     </w:p>
     <w:p>
       <w:pPr>
@@ -6080,7 +6127,7 @@
       <w:pPr>
         <w:pStyle w:val="4"/>
       </w:pPr>
-      <w:bookmarkStart w:id="17" w:name="_Toc235105925"/>
+      <w:bookmarkStart w:id="18" w:name="_Toc235173129"/>
       <w:r>
         <w:t>2</w:t>
       </w:r>
@@ -6105,7 +6152,7 @@
       <w:r>
         <w:t xml:space="preserve"> решения</w:t>
       </w:r>
-      <w:bookmarkEnd w:id="17"/>
+      <w:bookmarkEnd w:id="18"/>
     </w:p>
     <w:p>
       <w:pPr>
@@ -6254,7 +6301,7 @@
       <w:pPr>
         <w:pStyle w:val="4"/>
       </w:pPr>
-      <w:bookmarkStart w:id="18" w:name="_Toc235105926"/>
+      <w:bookmarkStart w:id="19" w:name="_Toc235173130"/>
       <w:r>
         <w:t>2</w:t>
       </w:r>
@@ -6273,7 +6320,7 @@
       <w:r>
         <w:t xml:space="preserve"> Функция приспособленности</w:t>
       </w:r>
-      <w:bookmarkEnd w:id="18"/>
+      <w:bookmarkEnd w:id="19"/>
     </w:p>
     <w:p>
       <w:pPr>
@@ -6358,7 +6405,7 @@
       <w:pPr>
         <w:pStyle w:val="4"/>
       </w:pPr>
-      <w:bookmarkStart w:id="19" w:name="_Toc235105927"/>
+      <w:bookmarkStart w:id="20" w:name="_Toc235173131"/>
       <w:r>
         <w:t>2</w:t>
       </w:r>
@@ -6386,7 +6433,7 @@
       <w:r>
         <w:t>а</w:t>
       </w:r>
-      <w:bookmarkEnd w:id="19"/>
+      <w:bookmarkEnd w:id="20"/>
     </w:p>
     <w:p>
       <w:pPr>
@@ -6482,7 +6529,7 @@
       <w:pPr>
         <w:pStyle w:val="4"/>
       </w:pPr>
-      <w:bookmarkStart w:id="20" w:name="_Toc235105928"/>
+      <w:bookmarkStart w:id="21" w:name="_Toc235173132"/>
       <w:r>
         <w:t>2</w:t>
       </w:r>
@@ -6501,7 +6548,7 @@
       <w:r>
         <w:t>Оператор скрещивания</w:t>
       </w:r>
-      <w:bookmarkEnd w:id="20"/>
+      <w:bookmarkEnd w:id="21"/>
     </w:p>
     <w:p>
       <w:pPr>
@@ -6539,7 +6586,7 @@
       <w:pPr>
         <w:pStyle w:val="4"/>
       </w:pPr>
-      <w:bookmarkStart w:id="21" w:name="_Toc235105929"/>
+      <w:bookmarkStart w:id="22" w:name="_Toc235173133"/>
       <w:r>
         <w:t>2</w:t>
       </w:r>
@@ -6558,7 +6605,7 @@
       <w:r>
         <w:t xml:space="preserve"> Оператор мутации</w:t>
       </w:r>
-      <w:bookmarkEnd w:id="21"/>
+      <w:bookmarkEnd w:id="22"/>
     </w:p>
     <w:p>
       <w:pPr>
@@ -6614,7 +6661,7 @@
       <w:pPr>
         <w:pStyle w:val="4"/>
       </w:pPr>
-      <w:bookmarkStart w:id="22" w:name="_Toc235105930"/>
+      <w:bookmarkStart w:id="23" w:name="_Toc235173134"/>
       <w:r>
         <w:t>2</w:t>
       </w:r>
@@ -6633,7 +6680,7 @@
       <w:r>
         <w:t xml:space="preserve"> Критерий завершения алгоритма</w:t>
       </w:r>
-      <w:bookmarkEnd w:id="22"/>
+      <w:bookmarkEnd w:id="23"/>
     </w:p>
     <w:p>
       <w:pPr>
@@ -6696,11 +6743,11 @@
       <w:pPr>
         <w:pStyle w:val="4"/>
       </w:pPr>
-      <w:bookmarkStart w:id="23" w:name="_Toc235105931"/>
+      <w:bookmarkStart w:id="24" w:name="_Toc235173135"/>
       <w:r>
         <w:t>2.3.8 Программная реализация</w:t>
       </w:r>
-      <w:bookmarkEnd w:id="23"/>
+      <w:bookmarkEnd w:id="24"/>
     </w:p>
     <w:p>
       <w:pPr>
@@ -6881,7 +6928,7 @@
           <w:numId w:val="2"/>
         </w:numPr>
       </w:pPr>
-      <w:bookmarkStart w:id="24" w:name="_Toc235105932"/>
+      <w:bookmarkStart w:id="25" w:name="_Toc235173136"/>
       <w:r>
         <w:t>2.</w:t>
       </w:r>
@@ -6897,7 +6944,7 @@
       <w:r>
         <w:t>Проектирование графического интерфейса</w:t>
       </w:r>
-      <w:bookmarkEnd w:id="24"/>
+      <w:bookmarkEnd w:id="25"/>
     </w:p>
     <w:p>
       <w:pPr>
@@ -6932,14 +6979,14 @@
       <w:pPr>
         <w:pStyle w:val="4"/>
       </w:pPr>
-      <w:bookmarkStart w:id="25" w:name="_Toc235105933"/>
+      <w:bookmarkStart w:id="26" w:name="_Toc235173137"/>
       <w:r>
         <w:t>2.4</w:t>
       </w:r>
       <w:r>
         <w:t>.1 Блок «Данные графа»</w:t>
       </w:r>
-      <w:bookmarkEnd w:id="25"/>
+      <w:bookmarkEnd w:id="26"/>
     </w:p>
     <w:p>
       <w:pPr>
@@ -7171,7 +7218,7 @@
       <w:pPr>
         <w:pStyle w:val="4"/>
       </w:pPr>
-      <w:bookmarkStart w:id="26" w:name="_Toc235105934"/>
+      <w:bookmarkStart w:id="27" w:name="_Toc235173138"/>
       <w:r>
         <w:lastRenderedPageBreak/>
         <w:t>2.</w:t>
@@ -7182,7 +7229,7 @@
       <w:r>
         <w:t>.2 Блок «Параметры генетического алгоритма»</w:t>
       </w:r>
-      <w:bookmarkEnd w:id="26"/>
+      <w:bookmarkEnd w:id="27"/>
     </w:p>
     <w:p>
       <w:pPr>
@@ -7432,7 +7479,7 @@
       <w:pPr>
         <w:pStyle w:val="4"/>
       </w:pPr>
-      <w:bookmarkStart w:id="27" w:name="_Toc235105935"/>
+      <w:bookmarkStart w:id="28" w:name="_Toc235173139"/>
       <w:r>
         <w:t>2.</w:t>
       </w:r>
@@ -7442,7 +7489,7 @@
       <w:r>
         <w:t>.3 Блок «Информация»</w:t>
       </w:r>
-      <w:bookmarkEnd w:id="27"/>
+      <w:bookmarkEnd w:id="28"/>
     </w:p>
     <w:p>
       <w:pPr>
@@ -7710,7 +7757,7 @@
       <w:pPr>
         <w:pStyle w:val="4"/>
       </w:pPr>
-      <w:bookmarkStart w:id="28" w:name="_Toc235105936"/>
+      <w:bookmarkStart w:id="29" w:name="_Toc235173140"/>
       <w:r>
         <w:t>2.</w:t>
       </w:r>
@@ -7720,7 +7767,7 @@
       <w:r>
         <w:t>.4 Блок «Управление»</w:t>
       </w:r>
-      <w:bookmarkEnd w:id="28"/>
+      <w:bookmarkEnd w:id="29"/>
     </w:p>
     <w:p>
       <w:pPr>
@@ -7982,7 +8029,7 @@
       <w:pPr>
         <w:pStyle w:val="4"/>
       </w:pPr>
-      <w:bookmarkStart w:id="29" w:name="_Toc235105937"/>
+      <w:bookmarkStart w:id="30" w:name="_Toc235173141"/>
       <w:r>
         <w:t>2.</w:t>
       </w:r>
@@ -7992,7 +8039,7 @@
       <w:r>
         <w:t>.5 Блок «Визуализация»</w:t>
       </w:r>
-      <w:bookmarkEnd w:id="29"/>
+      <w:bookmarkEnd w:id="30"/>
     </w:p>
     <w:p>
       <w:pPr>
@@ -8204,7 +8251,7 @@
       <w:pPr>
         <w:pStyle w:val="4"/>
       </w:pPr>
-      <w:bookmarkStart w:id="30" w:name="_Toc235105938"/>
+      <w:bookmarkStart w:id="31" w:name="_Toc235173142"/>
       <w:r>
         <w:t>2.</w:t>
       </w:r>
@@ -8214,7 +8261,7 @@
       <w:r>
         <w:t>.6 Блок «График эволюции»</w:t>
       </w:r>
-      <w:bookmarkEnd w:id="30"/>
+      <w:bookmarkEnd w:id="31"/>
     </w:p>
     <w:p>
       <w:pPr>
@@ -8371,7 +8418,7 @@
           <w:numId w:val="2"/>
         </w:numPr>
       </w:pPr>
-      <w:bookmarkStart w:id="31" w:name="_Toc235105939"/>
+      <w:bookmarkStart w:id="32" w:name="_Toc235173143"/>
       <w:r>
         <w:t>2.</w:t>
       </w:r>
@@ -8384,7 +8431,7 @@
       <w:r>
         <w:t>Проектирование интеграции основного алгоритма в графический интерфейс</w:t>
       </w:r>
-      <w:bookmarkEnd w:id="31"/>
+      <w:bookmarkEnd w:id="32"/>
     </w:p>
     <w:p>
       <w:pPr>
@@ -8648,8 +8695,6 @@
       <w:r>
         <w:t>характеристик особи с минимальным значением функции приспособленности и графика изменения функции приспособленности</w:t>
       </w:r>
-      <w:bookmarkStart w:id="32" w:name="_GoBack"/>
-      <w:bookmarkEnd w:id="32"/>
       <w:r>
         <w:t>.</w:t>
       </w:r>
@@ -8683,7 +8728,7 @@
           <w:numId w:val="2"/>
         </w:numPr>
       </w:pPr>
-      <w:bookmarkStart w:id="33" w:name="_Toc235105940"/>
+      <w:bookmarkStart w:id="33" w:name="_Toc235173144"/>
       <w:r>
         <w:lastRenderedPageBreak/>
         <w:t>3 ИСПОЛЬЗУЕМЫЕ ТЕХНОЛОГИИ</w:t>
@@ -8695,7 +8740,7 @@
         <w:pStyle w:val="3"/>
         <w:ind w:left="0"/>
       </w:pPr>
-      <w:bookmarkStart w:id="34" w:name="_Toc235105941"/>
+      <w:bookmarkStart w:id="34" w:name="_Toc235173145"/>
       <w:r>
         <w:t>3.1 Генератор случайных чисел для генерации графа</w:t>
       </w:r>
@@ -8757,7 +8802,7 @@
         <w:pStyle w:val="3"/>
         <w:ind w:left="0"/>
       </w:pPr>
-      <w:bookmarkStart w:id="35" w:name="_Toc235105942"/>
+      <w:bookmarkStart w:id="35" w:name="_Toc235173146"/>
       <w:r>
         <w:t xml:space="preserve">3.2 Распределения для операторов </w:t>
       </w:r>
@@ -8862,7 +8907,7 @@
         <w:pStyle w:val="3"/>
         <w:ind w:left="0"/>
       </w:pPr>
-      <w:bookmarkStart w:id="36" w:name="_Toc235105943"/>
+      <w:bookmarkStart w:id="36" w:name="_Toc235173147"/>
       <w:r>
         <w:t>3.3 Библиотеки для графического интерфейса</w:t>
       </w:r>
@@ -8912,7 +8957,7 @@
       <w:pPr>
         <w:pStyle w:val="4"/>
       </w:pPr>
-      <w:bookmarkStart w:id="37" w:name="_Toc235105944"/>
+      <w:bookmarkStart w:id="37" w:name="_Toc235173148"/>
       <w:r>
         <w:t>3.3.1 Библиотека Dear ImGui</w:t>
       </w:r>
@@ -8972,7 +9017,7 @@
       <w:pPr>
         <w:pStyle w:val="4"/>
       </w:pPr>
-      <w:bookmarkStart w:id="38" w:name="_Toc235105945"/>
+      <w:bookmarkStart w:id="38" w:name="_Toc235173149"/>
       <w:r>
         <w:t xml:space="preserve">3.3.2 Библиотека </w:t>
       </w:r>
@@ -9094,7 +9139,7 @@
       <w:pPr>
         <w:pStyle w:val="4"/>
       </w:pPr>
-      <w:bookmarkStart w:id="39" w:name="_Toc235105946"/>
+      <w:bookmarkStart w:id="39" w:name="_Toc235173150"/>
       <w:r>
         <w:lastRenderedPageBreak/>
         <w:t>3.3.3 Библиотека ImPlot</w:t>
@@ -9151,7 +9196,7 @@
           <w:numId w:val="2"/>
         </w:numPr>
       </w:pPr>
-      <w:bookmarkStart w:id="40" w:name="_Toc235105947"/>
+      <w:bookmarkStart w:id="40" w:name="_Toc235173151"/>
       <w:r>
         <w:lastRenderedPageBreak/>
         <w:t>4 ОТЗЫВ РУКОВОДИТЕЛЯ</w:t>
@@ -9176,7 +9221,7 @@
         <w:pStyle w:val="2"/>
         <w:ind w:left="0"/>
       </w:pPr>
-      <w:bookmarkStart w:id="41" w:name="_Toc235105948"/>
+      <w:bookmarkStart w:id="41" w:name="_Toc235173152"/>
       <w:r>
         <w:lastRenderedPageBreak/>
         <w:t>ЗАКЛЮЧЕНИЕ</w:t>
@@ -9253,6 +9298,21 @@
     </w:p>
     <w:p>
       <w:pPr>
+        <w:pStyle w:val="a1"/>
+      </w:pPr>
+      <w:r>
+        <w:lastRenderedPageBreak/>
+        <w:t xml:space="preserve">Исходный код проекта: </w:t>
+      </w:r>
+      <w:r>
+        <w:t>https://github.com/StarikovNick/Educational-practice</w:t>
+      </w:r>
+      <w:r>
+        <w:t>.</w:t>
+      </w:r>
+    </w:p>
+    <w:p>
+      <w:pPr>
         <w:rPr>
           <w:rFonts w:cs="Times New Roman"/>
           <w:szCs w:val="28"/>
@@ -9271,7 +9331,7 @@
         </w:rPr>
       </w:pPr>
       <w:bookmarkStart w:id="42" w:name="_Toc73173388"/>
-      <w:bookmarkStart w:id="43" w:name="_Toc235105949"/>
+      <w:bookmarkStart w:id="43" w:name="_Toc235173153"/>
       <w:r>
         <w:rPr>
           <w:rFonts w:cs="Times New Roman"/>
@@ -9576,7 +9636,7 @@
           <w:rFonts w:cs="Times New Roman"/>
         </w:rPr>
       </w:pPr>
-      <w:bookmarkStart w:id="44" w:name="_Toc235105950"/>
+      <w:bookmarkStart w:id="44" w:name="_Toc235173154"/>
       <w:r>
         <w:rPr>
           <w:rFonts w:cs="Times New Roman"/>
@@ -9889,7 +9949,7 @@
         <w:rStyle w:val="a6"/>
         <w:noProof/>
       </w:rPr>
-      <w:t>30</w:t>
+      <w:t>4</w:t>
     </w:r>
     <w:r>
       <w:rPr>
@@ -13613,7 +13673,7 @@
 </file>
 
 <file path=customXml/itemProps1.xml><?xml version="1.0" encoding="utf-8"?>
-<ds:datastoreItem xmlns:ds="http://schemas.openxmlformats.org/officeDocument/2006/customXml" ds:itemID="{30B6BD1B-9FEF-42B2-B281-B8F783CDCDE0}">
+<ds:datastoreItem xmlns:ds="http://schemas.openxmlformats.org/officeDocument/2006/customXml" ds:itemID="{3F159D07-5A92-46AB-8F92-E932F195068A}">
   <ds:schemaRefs>
     <ds:schemaRef ds:uri="http://schemas.openxmlformats.org/officeDocument/2006/bibliography"/>
   </ds:schemaRefs>

</xml_diff>